<commit_message>
Cap. 2 reestruturado: respostas do autor sobre cobertura, categorias da comparação e teste dos domínios
Co-Authored-By: Claude Opus 5.5 <noreply@anthropic.com>
Claude-Session: https://claude.ai/code/session_018xC7Cok8TcW2K2Q15D36dt
</commit_message>
<xml_diff>
--- a/revisao/reescrita/cap2-reestruturado.docx
+++ b/revisao/reescrita/cap2-reestruturado.docx
@@ -177,17 +177,7 @@
         <w:t xml:space="preserve"> </w:t>
       </w:r>
       <w:r>
-        <w:t xml:space="preserve">with the same procedure. At this stage the reading had one purpose: to identify the responsibilities that the instruments declare for the site, and the quality factors on which the direct action of the site is already known and recognized. In each text we recorded, as a quality attribute, every requirement that concerns participant protection or the reliability of the results. Each entry held the attribute in our own words and the clause it comes from, with the excerpt of that clause. We also recorded the obligation that the clause creates and the party it binds. Informed consent, for example, was recorded once for each text that requires it.</w:t>
-      </w:r>
-      <w:r>
-        <w:t xml:space="preserve"> </w:t>
-      </w:r>
-      <w:r>
-        <w:rPr>
-          <w:bCs/>
-          <w:b/>
-        </w:rPr>
-        <w:t xml:space="preserve">[We checked the coverage of the entries against the 18 considerations listed in Section 7 of ICH E8(R1) [5].]</w:t>
+        <w:t xml:space="preserve">with the same procedure. At this stage the reading had one purpose: to identify the responsibilities that the instruments declare for the site, and the quality factors on which the direct action of the site is already known and recognized. In each text we recorded, as a quality attribute, every requirement that concerns participant protection or the reliability of the results. Each entry held the attribute in our own words and the clause it comes from, with the excerpt of that clause. We also recorded the obligation that the clause creates and the party it binds. Informed consent, for example, was recorded once for each text that requires it. We checked the coverage of the entries against the 18 considerations listed in Section 7 of ICH E8(R1) [5].</w:t>
       </w:r>
     </w:p>
     <w:p>
@@ -209,7 +199,18 @@
         <w:jc w:val="both"/>
       </w:pPr>
       <w:r>
-        <w:t xml:space="preserve">We merged the three sets of entries into a single matrix and compared the attributes clause by clause. Each attribute was sorted into one of three categories. An attribute is strongly harmonized when all three instruments create an equivalent obligation on the same party, and partly harmonized when the instruments agree on the principle but bind different parties or use different terms. It is unaddressed at site level when none of the instruments gives the site an obligation that matches the attribute, either because the obligation falls on the sponsor or because no instrument assigns it to any party in operational form. We call an attribute in this third category a gap. Section 3.2 reports the result of the comparison, and the same matrix was used again in Section 2.3.2 to derive the CtQ domains.</w:t>
+        <w:t xml:space="preserve">We merged the three sets of entries into a single matrix and compared the attributes clause by clause. Each attribute was sorted into one of three categories. An attribute is strongly harmonized when all three instruments create an equivalent obligation on the same party, and partly harmonized when the instruments agree on the principle but bind different parties or use different terms. It is unaddressed at site level when none of the instruments gives the site an obligation that matches the attribute, either because the obligation falls on the sponsor or because no instrument assigns it to any party in operational form. We call an attribute in this third category a gap.</w:t>
+      </w:r>
+    </w:p>
+    <w:p>
+      <w:pPr>
+        <w:pStyle w:val="BodyText"/>
+        <w:spacing w:before="0" w:after="0"/>
+        <w:ind w:firstLine="720"/>
+        <w:jc w:val="both"/>
+      </w:pPr>
+      <w:r>
+        <w:t xml:space="preserve">Attributes found in only some of the instruments were classified case by case. An attribute that is absent from ICH E6(R3) only because it is specific to medical devices, and that both device instruments address, was classified as partly harmonized. An attribute that one device instrument requires and the other does not was also classified as a gap, as with an explicit MDR requirement that ISO 14155:2026 does not contain, or a factor that ISO 14155:2026 treats as critical and the MDR does not require. Section 3.2 reports the result of the comparison, and the same matrix was used again in Section 2.3.2 to derive the CtQ domains.</w:t>
       </w:r>
     </w:p>
     <w:p>
@@ -973,7 +974,7 @@
         <w:jc w:val="both"/>
       </w:pPr>
       <w:r>
-        <w:t xml:space="preserve">In the third step, we tested each candidate domain against the four criteria of Section 2.3.1, applied together as a single judgment. For each domain we assessed whether a failure would affect participant protection or the reliability of the results to a meaningful degree, weighing its likelihood against its consequences, and whether the domain could be assigned to a party at the site and controlled on the basis of existing knowledge. Section 3.3 reports the retained domains.</w:t>
+        <w:t xml:space="preserve">In the third step, we tested each candidate domain against the four criteria of Section 2.3.1, applied together as a single judgment. For each domain we assessed whether a failure would affect participant protection or the reliability of the results to a meaningful degree, weighing its likelihood against its consequences. We also assessed whether control of the domain demands an assigned responsibility, and to which party it should be assigned. Finally, we checked whether the issue had already been identified, in the literature or in internal records, together with the risks and difficulties associated with it and any response or solution already available. Section 3.3 reports the retained domains.</w:t>
       </w:r>
     </w:p>
     <w:p>

</xml_diff>

<commit_message>
ISO 15189:2022 como referência estrutural [54], renumeração das referências seguintes e Eudamed na 2.2.5
Co-Authored-By: Claude Opus 5.5 <noreply@anthropic.com>
Claude-Session: https://claude.ai/code/session_018xC7Cok8TcW2K2Q15D36dt
</commit_message>
<xml_diff>
--- a/revisao/reescrita/cap2-reestruturado.docx
+++ b/revisao/reescrita/cap2-reestruturado.docx
@@ -141,7 +141,7 @@
         <w:jc w:val="both"/>
       </w:pPr>
       <w:r>
-        <w:t xml:space="preserve">We consulted three further standards: ISO 13485, ISO 14971 with its guidance document ISO/TR 24971, and ISO 15189. None of them creates an obligation for the investigational site, and we used them as models of a documented quality system held by other organizations in the same regulatory and supply chain.</w:t>
+        <w:t xml:space="preserve">We consulted three further standards: ISO 13485, ISO 14971 with its guidance document ISO/TR 24971, and ISO 15189:2022. None of them creates an obligation for the investigational site, and we used them as models of a documented quality system held by other organizations in the same regulatory and supply chain.</w:t>
       </w:r>
     </w:p>
     <w:p>
@@ -230,7 +230,7 @@
         <w:jc w:val="both"/>
       </w:pPr>
       <w:r>
-        <w:t xml:space="preserve">The review was narrative and did not follow the Preferred Reporting Items for Systematic Reviews and Meta-Analyses (PRISMA) statement. We chose a narrative review because its purpose was to map the problem space for a design process. It covered five fields: quality management in clinical research, SQA in trials, the methodology of surgical trials, the clinical literature on the shoulder, and the performance and readiness of investigational sites.</w:t>
+        <w:t xml:space="preserve">The literature relevant to this work is spread across five fields: quality management in clinical research, SQA in trials, the methodology of surgical trials, the clinical literature on the shoulder, and the performance measurement of investigational sites. We reviewed it narratively and kept to that scope, so that the review would not drift toward other questions. The review mapped the problem already described in these fields and showed gaps reported by other authors that our reading of the instruments had missed, and it also allowed us to test our first findings against published work.</w:t>
       </w:r>
     </w:p>
     <w:p>
@@ -292,7 +292,7 @@
         <w:jc w:val="both"/>
       </w:pPr>
       <w:r>
-        <w:t xml:space="preserve">We characterized the organizations that take part in shoulder device investigations from registry data, and Section 3.4.4 reports the results. Study records were retrieved through the public ClinicalTrials.gov application programming interface (API) v2, with documentation and records accessed on 20 September 2026. We used this source because it provides structured public records, including the facility fields that sponsors enter for participating locations.</w:t>
+        <w:t xml:space="preserve">We characterized the organizations that take part in shoulder device investigations from registry data, and Section 3.4.4 reports the results. We first searched the European database on medical devices (Eudamed), set up under the MDR. Applications for clinical investigations are submitted through its electronic system on clinical investigations (Articles 33 and 73). In the application, the sponsor must identify each investigational site and the principal investigator at each one (Annex XV, Chapter II, Section 3.1.3), and this information is public unless its confidentiality is justified (Article 73(3)) [10]. Eudamed did not return site-level data for the investigations searched, so we retrieved study records from ClinicalTrials.gov through its public application programming interface (API) v2, with records accessed on 20 September 2026. ClinicalTrials.gov provides structured, publicly accessible records, including the facility fields that sponsors enter for participating locations. Those fields are not always complete or consistent, as earlier assessments of ClinicalTrials.gov data quality have shown [50, 51].</w:t>
       </w:r>
     </w:p>
     <w:p>
@@ -303,7 +303,17 @@
         <w:jc w:val="both"/>
       </w:pPr>
       <w:r>
-        <w:t xml:space="preserve">We searched for interventional studies of shoulder conditions with a device intervention and an industry lead sponsor, with start dates between 2000 and 2026, and then kept the investigations of implantable shoulder devices. The industry restriction limited the population to investigations that generate pre-market or post-market evidence for these devices, and investigator-initiated studies, which follow a different sponsorship pathway, were excluded. After eligibility screening, the sample comprised 46 investigations. Their location data produced 335 organization-study links, which represented 235 distinct organizations in 18 countries after facility names were normalized and duplicate or related entries resolved. The registry data and the institutional sources used for classification were publicly available, and the analysis used no participant-level personal data.</w:t>
+        <w:t xml:space="preserve">We searched for interventional studies of shoulder conditions with a device intervention and an industry lead sponsor, with start dates between 2000 and 2026, and then kept the investigations of implantable shoulder devices. The industry restriction limited the population to investigations that generate pre-market or post-market evidence for these devices, and investigator-initiated studies, which follow a different sponsorship pathway, were excluded. After eligibility screening, the sample comprised 46 investigations. Their location data produced 335 site records, each linking one organization to one investigation. After facility names were normalized and duplicate or related entries resolved, these records corresponded to 235 distinct organizations in 18 countries. The site record was the unit of analysis, so an organization was counted once for each investigation in which it took part, and the distribution reflects how often each environment hosts investigational activity. The registry data and the institutional sources used for classification were publicly available, and the analysis used no participant-level personal data.</w:t>
+      </w:r>
+      <w:r>
+        <w:t xml:space="preserve"> </w:t>
+      </w:r>
+      <w:r>
+        <w:rPr>
+          <w:bCs/>
+          <w:b/>
+        </w:rPr>
+        <w:t xml:space="preserve">[Cite the university or faculty decision on ethical review or exemption.]</w:t>
       </w:r>
     </w:p>
     <w:p>
@@ -314,7 +324,7 @@
         <w:jc w:val="both"/>
       </w:pPr>
       <w:r>
-        <w:t xml:space="preserve">ClinicalTrials.gov records each study location under the facility name entered by the sponsor. Because naming conventions vary across countries and organizations, we normalized spelling variants and former names, and merged multiple entries referring to the same organization. Where an entry named the sponsor, or a research foundation or other administrative entity, we resolved it to the clinical organization where the procedure was performed whenever public evidence allowed it. The organization was the unit of analysis, and each one was classified once, whatever the number of investigations or registered locations associated with it, and whatever its name variants. The registered facility name was used to locate the organization and was not treated as classification evidence by itself.</w:t>
+        <w:t xml:space="preserve">ClinicalTrials.gov records each study location under the facility name entered by the sponsor. Because naming conventions vary across countries and organizations, we normalized spelling variants and former names, and merged multiple entries referring to the same organization. Where an entry named the sponsor, or a research foundation or other administrative entity, we resolved it to the clinical organization where the procedure was performed whenever public evidence allowed it. Each organization was classified once, and its category was applied to all of its site records. The registered facility name was used to locate the organization and was not treated as classification evidence by itself.</w:t>
       </w:r>
     </w:p>
     <w:p>
@@ -1034,7 +1044,34 @@
         <w:jc w:val="both"/>
       </w:pPr>
       <w:r>
-        <w:t xml:space="preserve">We used standards that govern other organizations in the device conformity chain as structural references. ISO 13485 organizes the quality system of a manufacturer from management responsibility to measurement and improvement [52], and ISO 14971 sets a documented risk-management cycle from planning to post-production activity [53]. ISO 14155:2026 places clinical quality management on the sponsor in Clause 9.1 [8]. We synthesized four functions from the clauses these standards share and from the design requirements, and these became the four pillars of the framework: Governance, Risk Management, Operational Controls, and Performance Oversight. Section 4.1 gives the clause mapping behind each pillar. ISO 15189 remained a structural analogy, and we did not map its clauses.</w:t>
+        <w:t xml:space="preserve">We used standards that govern other organizations in the device conformity chain as structural references. The four pillars follow the main clauses of ISO 13485, management responsibility (Clause 5), product realization (Clause 7), and measurement, analysis and improvement (Clause 8) [52]. ISO 13485 treats risk as an approach applied across these processes (Clauses 4.1.2 and 7.1), while ISO 14971 sets risk management out as a documented cycle of its own, from planning and analysis through evaluation, control, review, and post-production activity [53]. We therefore made risk management a separate pillar, which gave four functions: Governance, Risk Management, Operational Controls, and Performance Oversight. ISO 14155:2026 places clinical quality management on the sponsor (Clause 9.1), and none of these standards was written for the investigational site [8].</w:t>
+      </w:r>
+    </w:p>
+    <w:p>
+      <w:pPr>
+        <w:pStyle w:val="BodyText"/>
+        <w:spacing w:before="0" w:after="0"/>
+        <w:ind w:firstLine="720"/>
+        <w:jc w:val="both"/>
+      </w:pPr>
+      <w:r>
+        <w:t xml:space="preserve">ISO 15189:2022, which sets requirements for quality and competence in medical laboratories, served as a second structural reference, because a medical laboratory, like an investigational site, produces results on which another party bases a decision [54]. Its requirements follow the same order. Clause 5 sets out structural and governance requirements and places risk management among them (Clause 5.6), and Clause 7 organizes the process requirements by phase, into pre-examination, examination, and post-examination processes. Clause 8 covers the management system, including actions on risks and opportunities (Clause 8.5), and evaluations through quality indicators and internal audits (Clause 8.8), followed by management reviews (Clause 8.9).</w:t>
+      </w:r>
+      <w:r>
+        <w:t xml:space="preserve"> </w:t>
+      </w:r>
+      <w:r>
+        <w:rPr>
+          <w:bCs/>
+          <w:b/>
+        </w:rPr>
+        <w:t xml:space="preserve">[We used its organization of processes by phase as a model for organizing the operational controls around the phases of a surgical investigation (Section 4.6).]</w:t>
+      </w:r>
+      <w:r>
+        <w:t xml:space="preserve"> </w:t>
+      </w:r>
+      <w:r>
+        <w:t xml:space="preserve">Section 4.1 gives the clause mapping behind each pillar.</w:t>
       </w:r>
     </w:p>
     <w:p>
@@ -1118,7 +1155,7 @@
         <w:jc w:val="both"/>
       </w:pPr>
       <w:r>
-        <w:t xml:space="preserve">The registry analysis depends on the facility fields that sponsors enter in ClinicalTrials.gov, which earlier assessments have found to be not always complete or consistent [50, 51]. We did not compare the European registry, the Clinical Trials Information System (CTIS), with ClinicalTrials.gov, and the analysis makes no claim about their equivalence. The classification relied on public institutional information, which may not show daily operational arrangements or informal affiliations and may be out of date where an organization changed recently, so it describes the documented institutional structure at the time of verification. The sample was concentrated in the United States, which accounted for 149 of the 235 organizations (63.4%) and for 60 of the 65 nonhospital organizations, so the distribution does not represent European investigation sites. Each normalized organization contributed one observation. This kept organizations that appear in several investigations from receiving extra weight, but it also gave equal weight to organizations with different numbers of studies and enrolled participants, so the results describe the participating organizations and do not measure their share of investigation activity.</w:t>
+        <w:t xml:space="preserve">The registry analysis depends on the facility fields that sponsors enter in ClinicalTrials.gov (Section 2.2.5). The classification relied on public institutional information, which may not show daily operational arrangements or informal affiliations and may be out of date where an organization changed recently, so it describes the documented institutional structure at the time of verification. The sample was concentrated in the United States, which accounted for 149 of the 235 organizations (63.4%) and for 60 of the 65 nonhospital organizations, so the distribution does not represent European investigation sites. Each site record contributed one observation, so organizations that take part in many investigations carry more weight than those that took part once. A site record does not show how many participants an organization enrolled, so the distribution describes how often each environment hosts an investigation and does not measure its share of enrolled participants.</w:t>
       </w:r>
     </w:p>
     <w:p>

</xml_diff>

<commit_message>
Argumento do encaixe dos pilares sai da metodologia e fica anotado para o Cap. 3
Co-Authored-By: Claude Opus 5.5 <noreply@anthropic.com>
Claude-Session: https://claude.ai/code/session_018xC7Cok8TcW2K2Q15D36dt
</commit_message>
<xml_diff>
--- a/revisao/reescrita/cap2-reestruturado.docx
+++ b/revisao/reescrita/cap2-reestruturado.docx
@@ -1156,17 +1156,6 @@
       </w:pPr>
       <w:r>
         <w:t xml:space="preserve">The registry analysis depends on the facility fields that sponsors enter in ClinicalTrials.gov (Section 2.2.5). The classification relied on public institutional information, which may not show daily operational arrangements or informal affiliations and may be out of date where an organization changed recently, so it describes the documented institutional structure at the time of verification. The sample was concentrated in the United States, which accounted for 149 of the 235 organizations (63.4%) and for 60 of the 65 nonhospital organizations, so the distribution does not represent European investigation sites. Each site record contributed one observation, so organizations that take part in many investigations carry more weight than those that took part once. A site record does not show how many participants an organization enrolled, so the distribution describes how often each environment hosts an investigation and does not measure its share of enrolled participants.</w:t>
-      </w:r>
-    </w:p>
-    <w:p>
-      <w:pPr>
-        <w:pStyle w:val="BodyText"/>
-        <w:spacing w:before="0" w:after="0"/>
-        <w:ind w:firstLine="720"/>
-        <w:jc w:val="both"/>
-      </w:pPr>
-      <w:r>
-        <w:t xml:space="preserve">The pillars were synthesized partly from the design requirements, so the fit between the two follows from the construction and does not show that the four pillars are the only possible structure.</w:t>
       </w:r>
     </w:p>
     <w:p>

</xml_diff>